<commit_message>
Add executive summaries to monthly reports
</commit_message>
<xml_diff>
--- a/reports/2026-06_cardura_focus_report.docx
+++ b/reports/2026-06_cardura_focus_report.docx
@@ -28,6 +28,99 @@
         </w:rPr>
         <w:t>数据范围：2026-06-01 至 2026-06-30｜来源：产品/竞品研究进展 + NKOL 微信/PubMed 明细</w:t>
       </w:r>
+    </w:p>
+    <w:p>
+      <w:pPr>
+        <w:spacing w:before="200" w:after="120"/>
+      </w:pPr>
+      <w:r>
+        <w:rPr>
+          <w:rFonts w:ascii="Microsoft YaHei" w:hAnsi="Microsoft YaHei" w:eastAsia="微软雅黑"/>
+          <w:b/>
+          <w:color w:val="0F766D"/>
+          <w:sz w:val="28"/>
+        </w:rPr>
+        <w:t>管理层摘要</w:t>
+      </w:r>
+    </w:p>
+    <w:p>
+      <w:pPr>
+        <w:spacing w:after="100" w:line="300" w:lineRule="auto"/>
+      </w:pPr>
+      <w:r>
+        <w:rPr>
+          <w:rFonts w:ascii="Microsoft YaHei" w:hAnsi="Microsoft YaHei" w:eastAsia="微软雅黑"/>
+          <w:b/>
+          <w:color w:val="173B3A"/>
+          <w:sz w:val="23"/>
+        </w:rPr>
+        <w:t>6月可多华的核心信号是：BPH/LUTS竞争主要来自坦索罗辛、他达拉非和5α还原酶抑制剂，可多华需要关注α受体阻滞剂一线替代与长期疾病管理方案。</w:t>
+      </w:r>
+    </w:p>
+    <w:p>
+      <w:pPr>
+        <w:spacing w:after="60" w:line="293" w:lineRule="auto"/>
+        <w:ind w:left="160"/>
+      </w:pPr>
+      <w:r>
+        <w:rPr>
+          <w:rFonts w:ascii="Microsoft YaHei" w:hAnsi="Microsoft YaHei" w:eastAsia="微软雅黑"/>
+          <w:b w:val="0"/>
+          <w:color w:val="253638"/>
+          <w:sz w:val="21"/>
+        </w:rPr>
+        <w:t>发生了什么：本月纳入25条产品/竞品进展，12条建议跟进、5条高证据；高证据主要来自坦索罗辛、他达拉非和度他雄胺相关临床或论文更新。</w:t>
+      </w:r>
+    </w:p>
+    <w:p>
+      <w:pPr>
+        <w:spacing w:after="60" w:line="293" w:lineRule="auto"/>
+        <w:ind w:left="160"/>
+      </w:pPr>
+      <w:r>
+        <w:rPr>
+          <w:rFonts w:ascii="Microsoft YaHei" w:hAnsi="Microsoft YaHei" w:eastAsia="微软雅黑"/>
+          <w:b w:val="0"/>
+          <w:color w:val="253638"/>
+          <w:sz w:val="21"/>
+        </w:rPr>
+        <w:t>关注什么：优先看哈乐/坦索罗辛在急性尿潴留和BPH场景的研究、希爱力每日剂量在LUTS场景的证据、度他雄胺长期疾病进展管理。</w:t>
+      </w:r>
+    </w:p>
+    <w:p>
+      <w:pPr>
+        <w:spacing w:after="60" w:line="293" w:lineRule="auto"/>
+        <w:ind w:left="160"/>
+      </w:pPr>
+      <w:r>
+        <w:rPr>
+          <w:rFonts w:ascii="Microsoft YaHei" w:hAnsi="Microsoft YaHei" w:eastAsia="微软雅黑"/>
+          <w:b w:val="0"/>
+          <w:color w:val="253638"/>
+          <w:sz w:val="21"/>
+        </w:rPr>
+        <w:t>为什么关注：这些竞品覆盖症状快速改善、性功能相关获益和前列腺体积/进展管理，可能分流可多华在BPH患者中的用药场景。</w:t>
+      </w:r>
+    </w:p>
+    <w:p>
+      <w:pPr>
+        <w:spacing w:after="60" w:line="293" w:lineRule="auto"/>
+        <w:ind w:left="160"/>
+      </w:pPr>
+      <w:r>
+        <w:rPr>
+          <w:rFonts w:ascii="Microsoft YaHei" w:hAnsi="Microsoft YaHei" w:eastAsia="微软雅黑"/>
+          <w:b w:val="0"/>
+          <w:color w:val="253638"/>
+          <w:sz w:val="21"/>
+        </w:rPr>
+        <w:t>建议动作：整理可多华与坦索罗辛、他达拉非、度他雄胺的患者分层差异；优先核对高证据研究终点；形成BPH场景下的竞品话术和风险点。</w:t>
+      </w:r>
+    </w:p>
+    <w:p>
+      <w:pPr>
+        <w:spacing w:after="40"/>
+      </w:pPr>
     </w:p>
     <w:p>
       <w:pPr>

</xml_diff>